<commit_message>
Added .gitignore and made changes
</commit_message>
<xml_diff>
--- a/Business/IdForm.docx
+++ b/Business/IdForm.docx
@@ -1,6 +1,6 @@
 
 <file path=word/document.xml><?xml version="1.0" encoding="utf-8"?>
-<w:document xmlns:wpc="http://schemas.microsoft.com/office/word/2010/wordprocessingCanvas" xmlns:cx="http://schemas.microsoft.com/office/drawing/2014/chartex" xmlns:cx1="http://schemas.microsoft.com/office/drawing/2015/9/8/chartex" xmlns:cx2="http://schemas.microsoft.com/office/drawing/2015/10/21/chartex" xmlns:cx3="http://schemas.microsoft.com/office/drawing/2016/5/9/chartex" xmlns:cx4="http://schemas.microsoft.com/office/drawing/2016/5/10/chartex" xmlns:cx5="http://schemas.microsoft.com/office/drawing/2016/5/11/chartex" xmlns:cx6="http://schemas.microsoft.com/office/drawing/2016/5/12/chartex" xmlns:cx7="http://schemas.microsoft.com/office/drawing/2016/5/13/chartex" xmlns:cx8="http://schemas.microsoft.com/office/drawing/2016/5/14/chartex" xmlns:mc="http://schemas.openxmlformats.org/markup-compatibility/2006" xmlns:aink="http://schemas.microsoft.com/office/drawing/2016/ink" xmlns:am3d="http://schemas.microsoft.com/office/drawing/2017/model3d" xmlns:o="urn:schemas-microsoft-com:office:office" xmlns:r="http://schemas.openxmlformats.org/officeDocument/2006/relationships" xmlns:m="http://schemas.openxmlformats.org/officeDocument/2006/math" xmlns:v="urn:schemas-microsoft-com:vml" xmlns:wp14="http://schemas.microsoft.com/office/word/2010/wordprocessingDrawing" xmlns:wp="http://schemas.openxmlformats.org/drawingml/2006/wordprocessingDrawing" xmlns:w10="urn:schemas-microsoft-com:office:word" xmlns:w="http://schemas.openxmlformats.org/wordprocessingml/2006/main" xmlns:w14="http://schemas.microsoft.com/office/word/2010/wordml" xmlns:w15="http://schemas.microsoft.com/office/word/2012/wordml" xmlns:w16cex="http://schemas.microsoft.com/office/word/2018/wordml/cex" xmlns:w16cid="http://schemas.microsoft.com/office/word/2016/wordml/cid" xmlns:w16="http://schemas.microsoft.com/office/word/2018/wordml" xmlns:w16sdtdh="http://schemas.microsoft.com/office/word/2020/wordml/sdtdatahash" xmlns:w16se="http://schemas.microsoft.com/office/word/2015/wordml/symex" xmlns:wpg="http://schemas.microsoft.com/office/word/2010/wordprocessingGroup" xmlns:wpi="http://schemas.microsoft.com/office/word/2010/wordprocessingInk" xmlns:wne="http://schemas.microsoft.com/office/word/2006/wordml" xmlns:wps="http://schemas.microsoft.com/office/word/2010/wordprocessingShape" mc:Ignorable="w14 w15 w16se w16cid w16 w16cex w16sdtdh wp14">
+<w:document xmlns:wpc="http://schemas.microsoft.com/office/word/2010/wordprocessingCanvas" xmlns:cx="http://schemas.microsoft.com/office/drawing/2014/chartex" xmlns:cx1="http://schemas.microsoft.com/office/drawing/2015/9/8/chartex" xmlns:cx2="http://schemas.microsoft.com/office/drawing/2015/10/21/chartex" xmlns:cx3="http://schemas.microsoft.com/office/drawing/2016/5/9/chartex" xmlns:cx4="http://schemas.microsoft.com/office/drawing/2016/5/10/chartex" xmlns:cx5="http://schemas.microsoft.com/office/drawing/2016/5/11/chartex" xmlns:cx6="http://schemas.microsoft.com/office/drawing/2016/5/12/chartex" xmlns:cx7="http://schemas.microsoft.com/office/drawing/2016/5/13/chartex" xmlns:cx8="http://schemas.microsoft.com/office/drawing/2016/5/14/chartex" xmlns:mc="http://schemas.openxmlformats.org/markup-compatibility/2006" xmlns:aink="http://schemas.microsoft.com/office/drawing/2016/ink" xmlns:am3d="http://schemas.microsoft.com/office/drawing/2017/model3d" xmlns:o="urn:schemas-microsoft-com:office:office" xmlns:oel="http://schemas.microsoft.com/office/2019/extlst" xmlns:r="http://schemas.openxmlformats.org/officeDocument/2006/relationships" xmlns:m="http://schemas.openxmlformats.org/officeDocument/2006/math" xmlns:v="urn:schemas-microsoft-com:vml" xmlns:wp14="http://schemas.microsoft.com/office/word/2010/wordprocessingDrawing" xmlns:wp="http://schemas.openxmlformats.org/drawingml/2006/wordprocessingDrawing" xmlns:w10="urn:schemas-microsoft-com:office:word" xmlns:w="http://schemas.openxmlformats.org/wordprocessingml/2006/main" xmlns:w14="http://schemas.microsoft.com/office/word/2010/wordml" xmlns:w15="http://schemas.microsoft.com/office/word/2012/wordml" xmlns:w16cex="http://schemas.microsoft.com/office/word/2018/wordml/cex" xmlns:w16cid="http://schemas.microsoft.com/office/word/2016/wordml/cid" xmlns:w16="http://schemas.microsoft.com/office/word/2018/wordml" xmlns:w16du="http://schemas.microsoft.com/office/word/2023/wordml/word16du" xmlns:w16sdtdh="http://schemas.microsoft.com/office/word/2020/wordml/sdtdatahash" xmlns:w16sdtfl="http://schemas.microsoft.com/office/word/2024/wordml/sdtformatlock" xmlns:w16se="http://schemas.microsoft.com/office/word/2015/wordml/symex" xmlns:wpg="http://schemas.microsoft.com/office/word/2010/wordprocessingGroup" xmlns:wpi="http://schemas.microsoft.com/office/word/2010/wordprocessingInk" xmlns:wne="http://schemas.microsoft.com/office/word/2006/wordml" xmlns:wps="http://schemas.microsoft.com/office/word/2010/wordprocessingShape" mc:Ignorable="w14 w15 w16se w16cid w16 w16cex w16sdtdh w16sdtfl w16du wp14">
   <w:body>
     <w:p>
       <w:pPr>
@@ -613,7 +613,6 @@
               </w:rPr>
               <w:t>_</w:t>
             </w:r>
-            <w:proofErr w:type="spellStart"/>
             <w:r>
               <w:rPr>
                 <w:rFonts w:ascii="Bahnschrift Light" w:hAnsi="Bahnschrift Light" w:cs="Segoe UI Semibold"/>
@@ -634,7 +633,6 @@
               </w:rPr>
               <w:t>Grp</w:t>
             </w:r>
-            <w:proofErr w:type="spellEnd"/>
           </w:p>
         </w:tc>
         <w:tc>
@@ -693,7 +691,7 @@
                 <w:sz w:val="20"/>
                 <w:szCs w:val="20"/>
               </w:rPr>
-              <w:t>Emergency</w:t>
+              <w:t>Empcode</w:t>
             </w:r>
           </w:p>
         </w:tc>
@@ -872,30 +870,14 @@
                                 <w:sz w:val="16"/>
                                 <w:szCs w:val="16"/>
                               </w:rPr>
-                              <w:t xml:space="preserve">Questions / </w:t>
-                            </w:r>
-                            <w:proofErr w:type="gramStart"/>
-                            <w:r>
-                              <w:rPr>
-                                <w:sz w:val="16"/>
-                                <w:szCs w:val="16"/>
-                              </w:rPr>
-                              <w:t xml:space="preserve">Queries  </w:t>
+                              <w:t xml:space="preserve">Questions / Queries  </w:t>
                             </w:r>
                             <w:r>
                               <w:rPr>
                                 <w:sz w:val="16"/>
                                 <w:szCs w:val="16"/>
                               </w:rPr>
-                              <w:t>–</w:t>
-                            </w:r>
-                            <w:proofErr w:type="gramEnd"/>
-                            <w:r>
-                              <w:rPr>
-                                <w:sz w:val="16"/>
-                                <w:szCs w:val="16"/>
-                              </w:rPr>
-                              <w:t xml:space="preserve"> Drop an email to mailmukeshkala@gmail.com</w:t>
+                              <w:t>– Drop an email to mailmukeshkala@gmail.com</w:t>
                             </w:r>
                           </w:p>
                         </w:txbxContent>
@@ -933,30 +915,14 @@
                           <w:sz w:val="16"/>
                           <w:szCs w:val="16"/>
                         </w:rPr>
-                        <w:t xml:space="preserve">Questions / </w:t>
-                      </w:r>
-                      <w:proofErr w:type="gramStart"/>
-                      <w:r>
-                        <w:rPr>
-                          <w:sz w:val="16"/>
-                          <w:szCs w:val="16"/>
-                        </w:rPr>
-                        <w:t xml:space="preserve">Queries  </w:t>
+                        <w:t xml:space="preserve">Questions / Queries  </w:t>
                       </w:r>
                       <w:r>
                         <w:rPr>
                           <w:sz w:val="16"/>
                           <w:szCs w:val="16"/>
                         </w:rPr>
-                        <w:t>–</w:t>
-                      </w:r>
-                      <w:proofErr w:type="gramEnd"/>
-                      <w:r>
-                        <w:rPr>
-                          <w:sz w:val="16"/>
-                          <w:szCs w:val="16"/>
-                        </w:rPr>
-                        <w:t xml:space="preserve"> Drop an email to mailmukeshkala@gmail.com</w:t>
+                        <w:t>– Drop an email to mailmukeshkala@gmail.com</w:t>
                       </w:r>
                     </w:p>
                   </w:txbxContent>
@@ -980,7 +946,7 @@
 </file>
 
 <file path=word/styles.xml><?xml version="1.0" encoding="utf-8"?>
-<w:styles xmlns:mc="http://schemas.openxmlformats.org/markup-compatibility/2006" xmlns:r="http://schemas.openxmlformats.org/officeDocument/2006/relationships" xmlns:w="http://schemas.openxmlformats.org/wordprocessingml/2006/main" xmlns:w14="http://schemas.microsoft.com/office/word/2010/wordml" xmlns:w15="http://schemas.microsoft.com/office/word/2012/wordml" xmlns:w16cex="http://schemas.microsoft.com/office/word/2018/wordml/cex" xmlns:w16cid="http://schemas.microsoft.com/office/word/2016/wordml/cid" xmlns:w16="http://schemas.microsoft.com/office/word/2018/wordml" xmlns:w16sdtdh="http://schemas.microsoft.com/office/word/2020/wordml/sdtdatahash" xmlns:w16se="http://schemas.microsoft.com/office/word/2015/wordml/symex" mc:Ignorable="w14 w15 w16se w16cid w16 w16cex w16sdtdh">
+<w:styles xmlns:mc="http://schemas.openxmlformats.org/markup-compatibility/2006" xmlns:r="http://schemas.openxmlformats.org/officeDocument/2006/relationships" xmlns:w="http://schemas.openxmlformats.org/wordprocessingml/2006/main" xmlns:w14="http://schemas.microsoft.com/office/word/2010/wordml" xmlns:w15="http://schemas.microsoft.com/office/word/2012/wordml" xmlns:w16cex="http://schemas.microsoft.com/office/word/2018/wordml/cex" xmlns:w16cid="http://schemas.microsoft.com/office/word/2016/wordml/cid" xmlns:w16="http://schemas.microsoft.com/office/word/2018/wordml" xmlns:w16du="http://schemas.microsoft.com/office/word/2023/wordml/word16du" xmlns:w16sdtdh="http://schemas.microsoft.com/office/word/2020/wordml/sdtdatahash" xmlns:w16sdtfl="http://schemas.microsoft.com/office/word/2024/wordml/sdtformatlock" xmlns:w16se="http://schemas.microsoft.com/office/word/2015/wordml/symex" mc:Ignorable="w14 w15 w16se w16cid w16 w16cex w16sdtdh w16sdtfl w16du">
   <w:docDefaults>
     <w:rPrDefault>
       <w:rPr>

</xml_diff>